<commit_message>
Refine public survey experience and documentation
</commit_message>
<xml_diff>
--- a/deliverables/Prime_Control_NPS_Documentacao_Executiva_Tecnica.docx
+++ b/deliverables/Prime_Control_NPS_Documentacao_Executiva_Tecnica.docx
@@ -389,7 +389,7 @@
           <w:color w:val="5C6F82"/>
           <w:sz w:val="20"/>
         </w:rPr>
-        <w:t>Versão: 1.2 | Atualizado em: 21/05/2026</w:t>
+        <w:t>Versão: 1.3 | Atualizado em: 22/05/2026</w:t>
       </w:r>
     </w:p>
     <w:p>
@@ -754,7 +754,7 @@
           <w:color w:val="102A43"/>
           <w:sz w:val="20"/>
         </w:rPr>
-        <w:t>Salvar progresso e permitir retomada por token individual.</w:t>
+        <w:t>Salvar progresso e permitir retomada por controle interno invisível para o cliente.</w:t>
       </w:r>
     </w:p>
     <w:p>
@@ -1951,7 +1951,7 @@
                 <w:color w:val="102A43"/>
                 <w:sz w:val="18"/>
               </w:rPr>
-              <w:t>O que já foi feito, próximos passos e atualização contínua.</w:t>
+              <w:t>O que já foi feito, ajustes de UX, próximos passos e atualização contínua.</w:t>
             </w:r>
           </w:p>
         </w:tc>
@@ -2881,7 +2881,7 @@
                 <w:color w:val="102A43"/>
                 <w:sz w:val="18"/>
               </w:rPr>
-              <w:t>Dados pré-preenchidos via HubSpot/token.</w:t>
+              <w:t>Dados pré-preenchidos via HubSpot e controle interno.</w:t>
             </w:r>
           </w:p>
         </w:tc>
@@ -4908,7 +4908,7 @@
                 <w:color w:val="102A43"/>
                 <w:sz w:val="18"/>
               </w:rPr>
-              <w:t>Respostas, sessões, tokens, progresso e eventos.</w:t>
+              <w:t>Respostas, sessões, identificação interna, progresso e eventos.</w:t>
             </w:r>
           </w:p>
         </w:tc>
@@ -5989,7 +5989,7 @@
                 <w:color w:val="102A43"/>
                 <w:sz w:val="18"/>
               </w:rPr>
-              <w:t>Retorno pelo token</w:t>
+              <w:t>Retorno à pesquisa</w:t>
             </w:r>
           </w:p>
         </w:tc>
@@ -6127,7 +6127,7 @@
           <w:color w:val="102A43"/>
           <w:sz w:val="20"/>
         </w:rPr>
-        <w:t>Identificação: empresa, contato, cargo, área e token/campaign_id.</w:t>
+        <w:t>Identificação: empresa, contato, cargo, área e campaign_id.</w:t>
       </w:r>
     </w:p>
     <w:p>
@@ -7194,7 +7194,7 @@
                 <w:color w:val="102A43"/>
                 <w:sz w:val="18"/>
               </w:rPr>
-              <w:t>Token seguro, HTTPS, LGPD</w:t>
+              <w:t>Controle interno seguro, HTTPS, LGPD</w:t>
             </w:r>
           </w:p>
         </w:tc>
@@ -7253,7 +7253,7 @@
           <w:color w:val="102A43"/>
           <w:sz w:val="20"/>
         </w:rPr>
-        <w:t>/nps/[token]: landing personalizada.</w:t>
+        <w:t>/: landing pública da campanha.</w:t>
       </w:r>
     </w:p>
     <w:p>
@@ -7268,7 +7268,7 @@
           <w:color w:val="102A43"/>
           <w:sz w:val="20"/>
         </w:rPr>
-        <w:t>/nps/[token]/survey: wizard da pesquisa.</w:t>
+        <w:t>/survey: wizard da pesquisa.</w:t>
       </w:r>
     </w:p>
     <w:p>
@@ -7283,7 +7283,7 @@
           <w:color w:val="102A43"/>
           <w:sz w:val="20"/>
         </w:rPr>
-        <w:t>/nps/[token]/complete: confirmação de conclusão.</w:t>
+        <w:t>/complete: confirmação de conclusão.</w:t>
       </w:r>
     </w:p>
     <w:p>
@@ -7473,7 +7473,7 @@
                 <w:color w:val="102A43"/>
                 <w:sz w:val="18"/>
               </w:rPr>
-              <w:t>Contato, empresa, token hash e status da jornada.</w:t>
+              <w:t>Contato, empresa, identificador interno e status da jornada.</w:t>
             </w:r>
           </w:p>
         </w:tc>
@@ -7687,7 +7687,7 @@
           <w:color w:val="102A43"/>
           <w:sz w:val="20"/>
         </w:rPr>
-        <w:t>Token aleatório, único e com expiração; armazenar hash do token, não token puro.</w:t>
+        <w:t>Identificador interno aleatório, único e com expiração; não expor esse controle na interface do cliente.</w:t>
       </w:r>
     </w:p>
     <w:p>
@@ -7987,7 +7987,7 @@
                 <w:color w:val="102A43"/>
                 <w:sz w:val="18"/>
               </w:rPr>
-              <w:t>Landing, wizard, token, autosave, retomada e persistência.</w:t>
+              <w:t>Landing, wizard, controle interno, autosave, retomada e persistência.</w:t>
             </w:r>
           </w:p>
         </w:tc>
@@ -8425,7 +8425,7 @@
           <w:color w:val="102A43"/>
           <w:sz w:val="20"/>
         </w:rPr>
-        <w:t>Preparar tokens individuais para envio via HubSpot.</w:t>
+        <w:t>Preparar controle interno de respondentes para envio via HubSpot.</w:t>
       </w:r>
     </w:p>
     <w:p>
@@ -8775,7 +8775,7 @@
           <w:color w:val="102A43"/>
           <w:sz w:val="20"/>
         </w:rPr>
-        <w:t>Antes da campanha: validar base HubSpot, tokens, tracking, dashboard e QA mobile.</w:t>
+        <w:t>Antes da campanha: validar base HubSpot, identificação interna, tracking, dashboard e QA mobile.</w:t>
       </w:r>
     </w:p>
     <w:p>
@@ -8834,7 +8834,7 @@
           <w:color w:val="102A43"/>
           <w:sz w:val="21"/>
         </w:rPr>
-        <w:t>A primeira versão navegável já foi criada para validar a experiência do respondente e agora já possui uma camada funcional de dados para MVP local.</w:t>
+        <w:t>A primeira versão navegável já foi criada para validar a experiência do respondente e agora possui uma camada funcional de dados, dashboard interno, Clarity, exportação CSV e estados controlados para acessos incorretos.</w:t>
       </w:r>
     </w:p>
     <w:tbl>
@@ -8950,7 +8950,7 @@
                 <w:color w:val="102A43"/>
                 <w:sz w:val="18"/>
               </w:rPr>
-              <w:t>Next.js, landing, fluxo multi-step, perguntas preservadas, autosave, APIs internas, persistência local, dashboard MVP, exportação CSV, logo e identidade visual.</w:t>
+              <w:t>Next.js, landing compacta, fluxo multi-step, perguntas preservadas, autosave, APIs internas, Supabase preparado, dashboard interno protegido, exportação CSV, logo, identidade visual, Clarity e estados controlados para erro/link inválido.</w:t>
             </w:r>
           </w:p>
         </w:tc>
@@ -8994,7 +8994,7 @@
                 <w:color w:val="102A43"/>
                 <w:sz w:val="18"/>
               </w:rPr>
-              <w:t>Banco de produção, autenticação do admin, importação de respondentes, XLSX, HubSpot, PostHog, GA4 e publicação no subdomínio.</w:t>
+              <w:t>Importação oficial de respondentes, XLSX, HubSpot, PostHog, GA4, subdomínio nps.primecontrol.com.br, refinamento final do dashboard e validação de campanha.</w:t>
             </w:r>
           </w:p>
         </w:tc>
@@ -9076,7 +9076,7 @@
           <w:color w:val="102A43"/>
           <w:sz w:val="20"/>
         </w:rPr>
-        <w:t>Home técnica do protótipo: http://localhost:3000</w:t>
+        <w:t>Raiz da plataforma: http://localhost:3000</w:t>
       </w:r>
     </w:p>
     <w:p>
@@ -9165,7 +9165,7 @@
           <w:color w:val="102A43"/>
           <w:sz w:val="21"/>
         </w:rPr>
-        <w:t>A plataforma deixou de ser apenas um protótipo visual e passou a salvar respostas em uma camada de dados local para MVP. Essa camada será substituída por Supabase/PostgreSQL em produção, mantendo a mesma lógica de APIs.</w:t>
+        <w:t>A plataforma deixou de ser apenas um protótipo visual e passou a operar como MVP funcional, com experiência pública, persistência de dados, dashboard interno protegido, exportação CSV e integração preparada com Microsoft Clarity.</w:t>
       </w:r>
     </w:p>
     <w:tbl>
@@ -9325,7 +9325,7 @@
                 <w:color w:val="102A43"/>
                 <w:sz w:val="18"/>
               </w:rPr>
-              <w:t>Arquivo local JSON para acelerar validação funcional.</w:t>
+              <w:t>Supabase em produção quando configurado; fallback local JSON para validação funcional.</w:t>
             </w:r>
           </w:p>
         </w:tc>
@@ -9369,7 +9369,7 @@
                 <w:color w:val="102A43"/>
                 <w:sz w:val="18"/>
               </w:rPr>
-              <w:t>Visão de convidados, iniciados, concluídos, completion rate e abandono por etapa.</w:t>
+              <w:t>Visão de convidados, participação, conclusão, abandono, NPS parcial, score de fricção, clientes silenciosos e exportação.</w:t>
             </w:r>
           </w:p>
         </w:tc>
@@ -9570,7 +9570,800 @@
           <w:color w:val="003F7D"/>
           <w:sz w:val="32"/>
         </w:rPr>
-        <w:t>14. Governança e atualização contínua</w:t>
+        <w:t>14. Ajustes recentes de UX e funcionalidade</w:t>
+      </w:r>
+    </w:p>
+    <w:tbl>
+      <w:tblPr>
+        <w:tblW w:type="auto" w:w="0"/>
+        <w:jc w:val="center"/>
+        <w:tblLayout w:type="fixed"/>
+        <w:tblLook w:firstColumn="1" w:firstRow="1" w:lastColumn="0" w:lastRow="0" w:noHBand="0" w:noVBand="1" w:val="04A0"/>
+        <w:tblBorders>
+          <w:top w:val="single" w:sz="8" w:space="0" w:color="003F7D"/>
+          <w:left w:val="single" w:sz="8" w:space="0" w:color="003F7D"/>
+          <w:bottom w:val="single" w:sz="8" w:space="0" w:color="003F7D"/>
+          <w:right w:val="single" w:sz="8" w:space="0" w:color="003F7D"/>
+          <w:insideH w:val="single" w:sz="8" w:space="0" w:color="003F7D"/>
+          <w:insideV w:val="single" w:sz="8" w:space="0" w:color="003F7D"/>
+        </w:tblBorders>
+        <w:tblCellMar>
+          <w:top w:w="140" w:type="dxa"/>
+          <w:start w:w="180" w:type="dxa"/>
+          <w:bottom w:w="140" w:type="dxa"/>
+          <w:end w:w="180" w:type="dxa"/>
+        </w:tblCellMar>
+      </w:tblPr>
+      <w:tblGrid>
+        <w:gridCol w:w="9878"/>
+      </w:tblGrid>
+      <w:tr>
+        <w:tc>
+          <w:tcPr>
+            <w:tcW w:type="dxa" w:w="9878"/>
+            <w:shd w:fill="E9F2FB"/>
+          </w:tcPr>
+          <w:p>
+            <w:pPr>
+              <w:spacing w:after="80"/>
+            </w:pPr>
+            <w:r>
+              <w:rPr>
+                <w:rFonts w:ascii="Arial" w:hAnsi="Arial"/>
+                <w:b/>
+                <w:color w:val="003F7D"/>
+                <w:sz w:val="21"/>
+              </w:rPr>
+              <w:t>Direção aprovada</w:t>
+            </w:r>
+          </w:p>
+          <w:p>
+            <w:pPr>
+              <w:spacing w:after="0"/>
+            </w:pPr>
+            <w:r>
+              <w:rPr>
+                <w:rFonts w:ascii="Arial" w:hAnsi="Arial"/>
+                <w:color w:val="102A43"/>
+                <w:sz w:val="20"/>
+              </w:rPr>
+              <w:t>Manter a experiência pública direta, leve e executiva. A tela inicial deve caber na primeira dobra sempre que possível, sem parecer uma landing pesada ou uma tela técnica.</w:t>
+            </w:r>
+          </w:p>
+        </w:tc>
+      </w:tr>
+    </w:tbl>
+    <w:p>
+      <w:pPr>
+        <w:spacing w:before="0" w:after="80" w:line="269" w:lineRule="auto"/>
+      </w:pPr>
+    </w:p>
+    <w:tbl>
+      <w:tblPr>
+        <w:tblW w:type="auto" w:w="0"/>
+        <w:jc w:val="center"/>
+        <w:tblLayout w:type="fixed"/>
+        <w:tblLook w:firstColumn="1" w:firstRow="1" w:lastColumn="0" w:lastRow="0" w:noHBand="0" w:noVBand="1" w:val="04A0"/>
+        <w:tblBorders>
+          <w:top w:val="single" w:sz="6" w:space="0" w:color="D7E2EC"/>
+          <w:left w:val="single" w:sz="6" w:space="0" w:color="D7E2EC"/>
+          <w:bottom w:val="single" w:sz="6" w:space="0" w:color="D7E2EC"/>
+          <w:right w:val="single" w:sz="6" w:space="0" w:color="D7E2EC"/>
+          <w:insideH w:val="single" w:sz="6" w:space="0" w:color="D7E2EC"/>
+          <w:insideV w:val="single" w:sz="6" w:space="0" w:color="D7E2EC"/>
+        </w:tblBorders>
+        <w:tblCellMar>
+          <w:top w:w="120" w:type="dxa"/>
+          <w:start w:w="180" w:type="dxa"/>
+          <w:bottom w:w="120" w:type="dxa"/>
+          <w:end w:w="180" w:type="dxa"/>
+        </w:tblCellMar>
+      </w:tblPr>
+      <w:tblGrid>
+        <w:gridCol w:w="3293"/>
+        <w:gridCol w:w="3293"/>
+        <w:gridCol w:w="3293"/>
+      </w:tblGrid>
+      <w:tr>
+        <w:trPr>
+          <w:tblHeader w:val="true"/>
+        </w:trPr>
+        <w:tc>
+          <w:tcPr>
+            <w:tcW w:type="dxa" w:w="1944"/>
+            <w:shd w:fill="003F7D"/>
+            <w:vAlign w:val="center"/>
+          </w:tcPr>
+          <w:p>
+            <w:pPr>
+              <w:spacing w:after="0"/>
+            </w:pPr>
+            <w:r/>
+            <w:r>
+              <w:rPr>
+                <w:rFonts w:ascii="Arial" w:hAnsi="Arial"/>
+                <w:b/>
+                <w:color w:val="FFFFFF"/>
+                <w:sz w:val="18"/>
+              </w:rPr>
+              <w:t>Ponto</w:t>
+            </w:r>
+          </w:p>
+        </w:tc>
+        <w:tc>
+          <w:tcPr>
+            <w:tcW w:type="dxa" w:w="3816"/>
+            <w:shd w:fill="003F7D"/>
+            <w:vAlign w:val="center"/>
+          </w:tcPr>
+          <w:p>
+            <w:pPr>
+              <w:spacing w:after="0"/>
+            </w:pPr>
+            <w:r/>
+            <w:r>
+              <w:rPr>
+                <w:rFonts w:ascii="Arial" w:hAnsi="Arial"/>
+                <w:b/>
+                <w:color w:val="FFFFFF"/>
+                <w:sz w:val="18"/>
+              </w:rPr>
+              <w:t>Decisão</w:t>
+            </w:r>
+          </w:p>
+        </w:tc>
+        <w:tc>
+          <w:tcPr>
+            <w:tcW w:type="dxa" w:w="3600"/>
+            <w:shd w:fill="003F7D"/>
+            <w:vAlign w:val="center"/>
+          </w:tcPr>
+          <w:p>
+            <w:pPr>
+              <w:spacing w:after="0"/>
+            </w:pPr>
+            <w:r/>
+            <w:r>
+              <w:rPr>
+                <w:rFonts w:ascii="Arial" w:hAnsi="Arial"/>
+                <w:b/>
+                <w:color w:val="FFFFFF"/>
+                <w:sz w:val="18"/>
+              </w:rPr>
+              <w:t>Racional</w:t>
+            </w:r>
+          </w:p>
+        </w:tc>
+      </w:tr>
+      <w:tr>
+        <w:tc>
+          <w:tcPr>
+            <w:tcW w:type="dxa" w:w="1944"/>
+            <w:vAlign w:val="center"/>
+          </w:tcPr>
+          <w:p>
+            <w:pPr>
+              <w:spacing w:after="0"/>
+            </w:pPr>
+            <w:r/>
+            <w:r>
+              <w:rPr>
+                <w:rFonts w:ascii="Arial" w:hAnsi="Arial"/>
+                <w:b w:val="0"/>
+                <w:color w:val="102A43"/>
+                <w:sz w:val="18"/>
+              </w:rPr>
+              <w:t>Tela inicial</w:t>
+            </w:r>
+          </w:p>
+        </w:tc>
+        <w:tc>
+          <w:tcPr>
+            <w:tcW w:type="dxa" w:w="3816"/>
+            <w:vAlign w:val="center"/>
+          </w:tcPr>
+          <w:p>
+            <w:pPr>
+              <w:spacing w:after="0"/>
+            </w:pPr>
+            <w:r/>
+            <w:r>
+              <w:rPr>
+                <w:rFonts w:ascii="Arial" w:hAnsi="Arial"/>
+                <w:b w:val="0"/>
+                <w:color w:val="102A43"/>
+                <w:sz w:val="18"/>
+              </w:rPr>
+              <w:t>Removido bloco lateral de 3 a 5 minutos; a informação permanece no topo.</w:t>
+            </w:r>
+          </w:p>
+        </w:tc>
+        <w:tc>
+          <w:tcPr>
+            <w:tcW w:type="dxa" w:w="3600"/>
+            <w:vAlign w:val="center"/>
+          </w:tcPr>
+          <w:p>
+            <w:pPr>
+              <w:spacing w:after="0"/>
+            </w:pPr>
+            <w:r/>
+            <w:r>
+              <w:rPr>
+                <w:rFonts w:ascii="Arial" w:hAnsi="Arial"/>
+                <w:b w:val="0"/>
+                <w:color w:val="102A43"/>
+                <w:sz w:val="18"/>
+              </w:rPr>
+              <w:t>Evita redundância e melhora fluidez visual.</w:t>
+            </w:r>
+          </w:p>
+        </w:tc>
+      </w:tr>
+      <w:tr>
+        <w:tc>
+          <w:tcPr>
+            <w:tcW w:type="dxa" w:w="1944"/>
+            <w:vAlign w:val="center"/>
+          </w:tcPr>
+          <w:p>
+            <w:pPr>
+              <w:spacing w:after="0"/>
+            </w:pPr>
+            <w:r/>
+            <w:r>
+              <w:rPr>
+                <w:rFonts w:ascii="Arial" w:hAnsi="Arial"/>
+                <w:b w:val="0"/>
+                <w:color w:val="102A43"/>
+                <w:sz w:val="18"/>
+              </w:rPr>
+              <w:t>Prazo</w:t>
+            </w:r>
+          </w:p>
+        </w:tc>
+        <w:tc>
+          <w:tcPr>
+            <w:tcW w:type="dxa" w:w="3816"/>
+            <w:vAlign w:val="center"/>
+          </w:tcPr>
+          <w:p>
+            <w:pPr>
+              <w:spacing w:after="0"/>
+            </w:pPr>
+            <w:r/>
+            <w:r>
+              <w:rPr>
+                <w:rFonts w:ascii="Arial" w:hAnsi="Arial"/>
+                <w:b w:val="0"/>
+                <w:color w:val="102A43"/>
+                <w:sz w:val="18"/>
+              </w:rPr>
+              <w:t>Prazo de validade exibido como nota discreta: 01/jun/26.</w:t>
+            </w:r>
+          </w:p>
+        </w:tc>
+        <w:tc>
+          <w:tcPr>
+            <w:tcW w:type="dxa" w:w="3600"/>
+            <w:vAlign w:val="center"/>
+          </w:tcPr>
+          <w:p>
+            <w:pPr>
+              <w:spacing w:after="0"/>
+            </w:pPr>
+            <w:r/>
+            <w:r>
+              <w:rPr>
+                <w:rFonts w:ascii="Arial" w:hAnsi="Arial"/>
+                <w:b w:val="0"/>
+                <w:color w:val="102A43"/>
+                <w:sz w:val="18"/>
+              </w:rPr>
+              <w:t>Cria senso de período ativo sem competir com o CTA.</w:t>
+            </w:r>
+          </w:p>
+        </w:tc>
+      </w:tr>
+      <w:tr>
+        <w:tc>
+          <w:tcPr>
+            <w:tcW w:type="dxa" w:w="1944"/>
+            <w:vAlign w:val="center"/>
+          </w:tcPr>
+          <w:p>
+            <w:pPr>
+              <w:spacing w:after="0"/>
+            </w:pPr>
+            <w:r/>
+            <w:r>
+              <w:rPr>
+                <w:rFonts w:ascii="Arial" w:hAnsi="Arial"/>
+                <w:b w:val="0"/>
+                <w:color w:val="102A43"/>
+                <w:sz w:val="18"/>
+              </w:rPr>
+              <w:t>Blocos de confiança</w:t>
+            </w:r>
+          </w:p>
+        </w:tc>
+        <w:tc>
+          <w:tcPr>
+            <w:tcW w:type="dxa" w:w="3816"/>
+            <w:vAlign w:val="center"/>
+          </w:tcPr>
+          <w:p>
+            <w:pPr>
+              <w:spacing w:after="0"/>
+            </w:pPr>
+            <w:r/>
+            <w:r>
+              <w:rPr>
+                <w:rFonts w:ascii="Arial" w:hAnsi="Arial"/>
+                <w:b w:val="0"/>
+                <w:color w:val="102A43"/>
+                <w:sz w:val="18"/>
+              </w:rPr>
+              <w:t>Mantidos três cards: Rápida, Responsável e Retomável.</w:t>
+            </w:r>
+          </w:p>
+        </w:tc>
+        <w:tc>
+          <w:tcPr>
+            <w:tcW w:type="dxa" w:w="3600"/>
+            <w:vAlign w:val="center"/>
+          </w:tcPr>
+          <w:p>
+            <w:pPr>
+              <w:spacing w:after="0"/>
+            </w:pPr>
+            <w:r/>
+            <w:r>
+              <w:rPr>
+                <w:rFonts w:ascii="Arial" w:hAnsi="Arial"/>
+                <w:b w:val="0"/>
+                <w:color w:val="102A43"/>
+                <w:sz w:val="18"/>
+              </w:rPr>
+              <w:t>Preserva clareza e reduz ruído visual.</w:t>
+            </w:r>
+          </w:p>
+        </w:tc>
+      </w:tr>
+      <w:tr>
+        <w:tc>
+          <w:tcPr>
+            <w:tcW w:type="dxa" w:w="1944"/>
+            <w:vAlign w:val="center"/>
+          </w:tcPr>
+          <w:p>
+            <w:pPr>
+              <w:spacing w:after="0"/>
+            </w:pPr>
+            <w:r/>
+            <w:r>
+              <w:rPr>
+                <w:rFonts w:ascii="Arial" w:hAnsi="Arial"/>
+                <w:b w:val="0"/>
+                <w:color w:val="102A43"/>
+                <w:sz w:val="18"/>
+              </w:rPr>
+              <w:t>Identificação</w:t>
+            </w:r>
+          </w:p>
+        </w:tc>
+        <w:tc>
+          <w:tcPr>
+            <w:tcW w:type="dxa" w:w="3816"/>
+            <w:vAlign w:val="center"/>
+          </w:tcPr>
+          <w:p>
+            <w:pPr>
+              <w:spacing w:after="0"/>
+            </w:pPr>
+            <w:r/>
+            <w:r>
+              <w:rPr>
+                <w:rFonts w:ascii="Arial" w:hAnsi="Arial"/>
+                <w:b w:val="0"/>
+                <w:color w:val="102A43"/>
+                <w:sz w:val="18"/>
+              </w:rPr>
+              <w:t>Campos usam placeholders, sem valores fictícios preenchidos.</w:t>
+            </w:r>
+          </w:p>
+        </w:tc>
+        <w:tc>
+          <w:tcPr>
+            <w:tcW w:type="dxa" w:w="3600"/>
+            <w:vAlign w:val="center"/>
+          </w:tcPr>
+          <w:p>
+            <w:pPr>
+              <w:spacing w:after="0"/>
+            </w:pPr>
+            <w:r/>
+            <w:r>
+              <w:rPr>
+                <w:rFonts w:ascii="Arial" w:hAnsi="Arial"/>
+                <w:b w:val="0"/>
+                <w:color w:val="102A43"/>
+                <w:sz w:val="18"/>
+              </w:rPr>
+              <w:t>Evita o trabalho de apagar dados de exemplo.</w:t>
+            </w:r>
+          </w:p>
+        </w:tc>
+      </w:tr>
+      <w:tr>
+        <w:tc>
+          <w:tcPr>
+            <w:tcW w:type="dxa" w:w="1944"/>
+            <w:vAlign w:val="center"/>
+          </w:tcPr>
+          <w:p>
+            <w:pPr>
+              <w:spacing w:after="0"/>
+            </w:pPr>
+            <w:r/>
+            <w:r>
+              <w:rPr>
+                <w:rFonts w:ascii="Arial" w:hAnsi="Arial"/>
+                <w:b w:val="0"/>
+                <w:color w:val="102A43"/>
+                <w:sz w:val="18"/>
+              </w:rPr>
+              <w:t>Tom</w:t>
+            </w:r>
+          </w:p>
+        </w:tc>
+        <w:tc>
+          <w:tcPr>
+            <w:tcW w:type="dxa" w:w="3816"/>
+            <w:vAlign w:val="center"/>
+          </w:tcPr>
+          <w:p>
+            <w:pPr>
+              <w:spacing w:after="0"/>
+            </w:pPr>
+            <w:r/>
+            <w:r>
+              <w:rPr>
+                <w:rFonts w:ascii="Arial" w:hAnsi="Arial"/>
+                <w:b w:val="0"/>
+                <w:color w:val="102A43"/>
+                <w:sz w:val="18"/>
+              </w:rPr>
+              <w:t>Texto mais natural: a Prime Control quer ouvir o cliente.</w:t>
+            </w:r>
+          </w:p>
+        </w:tc>
+        <w:tc>
+          <w:tcPr>
+            <w:tcW w:type="dxa" w:w="3600"/>
+            <w:vAlign w:val="center"/>
+          </w:tcPr>
+          <w:p>
+            <w:pPr>
+              <w:spacing w:after="0"/>
+            </w:pPr>
+            <w:r/>
+            <w:r>
+              <w:rPr>
+                <w:rFonts w:ascii="Arial" w:hAnsi="Arial"/>
+                <w:b w:val="0"/>
+                <w:color w:val="102A43"/>
+                <w:sz w:val="18"/>
+              </w:rPr>
+              <w:t>Reforça cuidado e convite direto.</w:t>
+            </w:r>
+          </w:p>
+        </w:tc>
+      </w:tr>
+      <w:tr>
+        <w:tc>
+          <w:tcPr>
+            <w:tcW w:type="dxa" w:w="1944"/>
+            <w:vAlign w:val="center"/>
+          </w:tcPr>
+          <w:p>
+            <w:pPr>
+              <w:spacing w:after="0"/>
+            </w:pPr>
+            <w:r/>
+            <w:r>
+              <w:rPr>
+                <w:rFonts w:ascii="Arial" w:hAnsi="Arial"/>
+                <w:b w:val="0"/>
+                <w:color w:val="102A43"/>
+                <w:sz w:val="18"/>
+              </w:rPr>
+              <w:t>Tela inicial</w:t>
+            </w:r>
+          </w:p>
+        </w:tc>
+        <w:tc>
+          <w:tcPr>
+            <w:tcW w:type="dxa" w:w="3816"/>
+            <w:vAlign w:val="center"/>
+          </w:tcPr>
+          <w:p>
+            <w:pPr>
+              <w:spacing w:after="0"/>
+            </w:pPr>
+            <w:r/>
+            <w:r>
+              <w:rPr>
+                <w:rFonts w:ascii="Arial" w:hAnsi="Arial"/>
+                <w:b w:val="0"/>
+                <w:color w:val="102A43"/>
+                <w:sz w:val="18"/>
+              </w:rPr>
+              <w:t>Raiz do site exibe a landing real da pesquisa.</w:t>
+            </w:r>
+          </w:p>
+        </w:tc>
+        <w:tc>
+          <w:tcPr>
+            <w:tcW w:type="dxa" w:w="3600"/>
+            <w:vAlign w:val="center"/>
+          </w:tcPr>
+          <w:p>
+            <w:pPr>
+              <w:spacing w:after="0"/>
+            </w:pPr>
+            <w:r/>
+            <w:r>
+              <w:rPr>
+                <w:rFonts w:ascii="Arial" w:hAnsi="Arial"/>
+                <w:b w:val="0"/>
+                <w:color w:val="102A43"/>
+                <w:sz w:val="18"/>
+              </w:rPr>
+              <w:t>Evita tela intermediária e reduz confusão.</w:t>
+            </w:r>
+          </w:p>
+        </w:tc>
+      </w:tr>
+      <w:tr>
+        <w:tc>
+          <w:tcPr>
+            <w:tcW w:type="dxa" w:w="1944"/>
+            <w:vAlign w:val="center"/>
+          </w:tcPr>
+          <w:p>
+            <w:pPr>
+              <w:spacing w:after="0"/>
+            </w:pPr>
+            <w:r/>
+            <w:r>
+              <w:rPr>
+                <w:rFonts w:ascii="Arial" w:hAnsi="Arial"/>
+                <w:b w:val="0"/>
+                <w:color w:val="102A43"/>
+                <w:sz w:val="18"/>
+              </w:rPr>
+              <w:t>Pesquisa não localizada</w:t>
+            </w:r>
+          </w:p>
+        </w:tc>
+        <w:tc>
+          <w:tcPr>
+            <w:tcW w:type="dxa" w:w="3816"/>
+            <w:vAlign w:val="center"/>
+          </w:tcPr>
+          <w:p>
+            <w:pPr>
+              <w:spacing w:after="0"/>
+            </w:pPr>
+            <w:r/>
+            <w:r>
+              <w:rPr>
+                <w:rFonts w:ascii="Arial" w:hAnsi="Arial"/>
+                <w:b w:val="0"/>
+                <w:color w:val="102A43"/>
+                <w:sz w:val="18"/>
+              </w:rPr>
+              <w:t>Acesso inválido mostra mensagem controlada.</w:t>
+            </w:r>
+          </w:p>
+        </w:tc>
+        <w:tc>
+          <w:tcPr>
+            <w:tcW w:type="dxa" w:w="3600"/>
+            <w:vAlign w:val="center"/>
+          </w:tcPr>
+          <w:p>
+            <w:pPr>
+              <w:spacing w:after="0"/>
+            </w:pPr>
+            <w:r/>
+            <w:r>
+              <w:rPr>
+                <w:rFonts w:ascii="Arial" w:hAnsi="Arial"/>
+                <w:b w:val="0"/>
+                <w:color w:val="102A43"/>
+                <w:sz w:val="18"/>
+              </w:rPr>
+              <w:t>Evita tela vazia, erro bruto ou criação de pesquisa indevida.</w:t>
+            </w:r>
+          </w:p>
+        </w:tc>
+      </w:tr>
+      <w:tr>
+        <w:tc>
+          <w:tcPr>
+            <w:tcW w:type="dxa" w:w="1944"/>
+            <w:vAlign w:val="center"/>
+          </w:tcPr>
+          <w:p>
+            <w:pPr>
+              <w:spacing w:after="0"/>
+            </w:pPr>
+            <w:r/>
+            <w:r>
+              <w:rPr>
+                <w:rFonts w:ascii="Arial" w:hAnsi="Arial"/>
+                <w:b w:val="0"/>
+                <w:color w:val="102A43"/>
+                <w:sz w:val="18"/>
+              </w:rPr>
+              <w:t>Erro global</w:t>
+            </w:r>
+          </w:p>
+        </w:tc>
+        <w:tc>
+          <w:tcPr>
+            <w:tcW w:type="dxa" w:w="3816"/>
+            <w:vAlign w:val="center"/>
+          </w:tcPr>
+          <w:p>
+            <w:pPr>
+              <w:spacing w:after="0"/>
+            </w:pPr>
+            <w:r/>
+            <w:r>
+              <w:rPr>
+                <w:rFonts w:ascii="Arial" w:hAnsi="Arial"/>
+                <w:b w:val="0"/>
+                <w:color w:val="102A43"/>
+                <w:sz w:val="18"/>
+              </w:rPr>
+              <w:t>Criada tela de instabilidade com ação de recarregar.</w:t>
+            </w:r>
+          </w:p>
+        </w:tc>
+        <w:tc>
+          <w:tcPr>
+            <w:tcW w:type="dxa" w:w="3600"/>
+            <w:vAlign w:val="center"/>
+          </w:tcPr>
+          <w:p>
+            <w:pPr>
+              <w:spacing w:after="0"/>
+            </w:pPr>
+            <w:r/>
+            <w:r>
+              <w:rPr>
+                <w:rFonts w:ascii="Arial" w:hAnsi="Arial"/>
+                <w:b w:val="0"/>
+                <w:color w:val="102A43"/>
+                <w:sz w:val="18"/>
+              </w:rPr>
+              <w:t>Reduz ansiedade e melhora recuperação.</w:t>
+            </w:r>
+          </w:p>
+        </w:tc>
+      </w:tr>
+    </w:tbl>
+    <w:p>
+      <w:pPr>
+        <w:spacing w:before="0" w:after="80" w:line="269" w:lineRule="auto"/>
+      </w:pPr>
+    </w:p>
+    <w:p>
+      <w:pPr>
+        <w:pStyle w:val="Heading2"/>
+        <w:keepNext/>
+      </w:pPr>
+      <w:r>
+        <w:rPr>
+          <w:rFonts w:ascii="Arial" w:hAnsi="Arial"/>
+          <w:b/>
+          <w:color w:val="003F7D"/>
+          <w:sz w:val="26"/>
+        </w:rPr>
+        <w:t>Regras de aceite da experiência pública</w:t>
+      </w:r>
+    </w:p>
+    <w:p>
+      <w:pPr>
+        <w:pStyle w:val="ListBullet"/>
+        <w:spacing w:after="60" w:line="269" w:lineRule="auto"/>
+        <w:ind w:left="360"/>
+      </w:pPr>
+      <w:r>
+        <w:rPr>
+          <w:rFonts w:ascii="Arial" w:hAnsi="Arial"/>
+          <w:color w:val="102A43"/>
+          <w:sz w:val="20"/>
+        </w:rPr>
+        <w:t>A landing não deve exibir informações técnicas internas.</w:t>
+      </w:r>
+    </w:p>
+    <w:p>
+      <w:pPr>
+        <w:pStyle w:val="ListBullet"/>
+        <w:spacing w:after="60" w:line="269" w:lineRule="auto"/>
+        <w:ind w:left="360"/>
+      </w:pPr>
+      <w:r>
+        <w:rPr>
+          <w:rFonts w:ascii="Arial" w:hAnsi="Arial"/>
+          <w:color w:val="102A43"/>
+          <w:sz w:val="20"/>
+        </w:rPr>
+        <w:t>O topo deve mostrar apenas o tempo estimado; a validade deve aparecer de forma discreta no conteúdo.</w:t>
+      </w:r>
+    </w:p>
+    <w:p>
+      <w:pPr>
+        <w:pStyle w:val="ListBullet"/>
+        <w:spacing w:after="60" w:line="269" w:lineRule="auto"/>
+        <w:ind w:left="360"/>
+      </w:pPr>
+      <w:r>
+        <w:rPr>
+          <w:rFonts w:ascii="Arial" w:hAnsi="Arial"/>
+          <w:color w:val="102A43"/>
+          <w:sz w:val="20"/>
+        </w:rPr>
+        <w:t>A primeira dobra deve conter logo, contexto, benefício, transparência e CTA.</w:t>
+      </w:r>
+    </w:p>
+    <w:p>
+      <w:pPr>
+        <w:pStyle w:val="ListBullet"/>
+        <w:spacing w:after="60" w:line="269" w:lineRule="auto"/>
+        <w:ind w:left="360"/>
+      </w:pPr>
+      <w:r>
+        <w:rPr>
+          <w:rFonts w:ascii="Arial" w:hAnsi="Arial"/>
+          <w:color w:val="102A43"/>
+          <w:sz w:val="20"/>
+        </w:rPr>
+        <w:t>Acesso inexistente não deve criar uma nova pesquisa automaticamente.</w:t>
+      </w:r>
+    </w:p>
+    <w:p>
+      <w:pPr>
+        <w:pStyle w:val="ListBullet"/>
+        <w:spacing w:after="60" w:line="269" w:lineRule="auto"/>
+        <w:ind w:left="360"/>
+      </w:pPr>
+      <w:r>
+        <w:rPr>
+          <w:rFonts w:ascii="Arial" w:hAnsi="Arial"/>
+          <w:color w:val="102A43"/>
+          <w:sz w:val="20"/>
+        </w:rPr>
+        <w:t>O cliente deve sempre receber uma orientação clara, mesmo em erro ou link incompleto.</w:t>
+      </w:r>
+    </w:p>
+    <w:p>
+      <w:pPr>
+        <w:pStyle w:val="Heading1"/>
+        <w:keepNext/>
+      </w:pPr>
+      <w:r>
+        <w:rPr>
+          <w:rFonts w:ascii="Arial" w:hAnsi="Arial"/>
+          <w:b/>
+          <w:color w:val="003F7D"/>
+          <w:sz w:val="32"/>
+        </w:rPr>
+        <w:t>15. Governança e atualização contínua</w:t>
       </w:r>
     </w:p>
     <w:p>

</xml_diff>

<commit_message>
Add corporate email validation and public survey reset
</commit_message>
<xml_diff>
--- a/deliverables/Prime_Control_NPS_Documentacao_Executiva_Tecnica.docx
+++ b/deliverables/Prime_Control_NPS_Documentacao_Executiva_Tecnica.docx
@@ -9839,7 +9839,7 @@
                 <w:color w:val="102A43"/>
                 <w:sz w:val="18"/>
               </w:rPr>
-              <w:t>Prazo de validade exibido como nota discreta: 01/jun/26.</w:t>
+              <w:t>Prazo de validade exibido como nota discreta: 01/06/2026.</w:t>
             </w:r>
           </w:p>
         </w:tc>
@@ -9991,6 +9991,136 @@
                 <w:sz w:val="18"/>
               </w:rPr>
               <w:t>Evita o trabalho de apagar dados de exemplo.</w:t>
+            </w:r>
+          </w:p>
+        </w:tc>
+      </w:tr>
+      <w:tr>
+        <w:tc>
+          <w:tcPr>
+            <w:tcW w:type="dxa" w:w="1944"/>
+            <w:vAlign w:val="center"/>
+          </w:tcPr>
+          <w:p>
+            <w:pPr>
+              <w:spacing w:after="0"/>
+            </w:pPr>
+            <w:r/>
+            <w:r>
+              <w:rPr>
+                <w:rFonts w:ascii="Arial" w:hAnsi="Arial"/>
+                <w:b w:val="0"/>
+                <w:color w:val="102A43"/>
+                <w:sz w:val="18"/>
+              </w:rPr>
+              <w:t>Validação</w:t>
+            </w:r>
+          </w:p>
+        </w:tc>
+        <w:tc>
+          <w:tcPr>
+            <w:tcW w:type="dxa" w:w="3816"/>
+            <w:vAlign w:val="center"/>
+          </w:tcPr>
+          <w:p>
+            <w:pPr>
+              <w:spacing w:after="0"/>
+            </w:pPr>
+            <w:r/>
+            <w:r>
+              <w:rPr>
+                <w:rFonts w:ascii="Arial" w:hAnsi="Arial"/>
+                <w:b w:val="0"/>
+                <w:color w:val="102A43"/>
+                <w:sz w:val="18"/>
+              </w:rPr>
+              <w:t>E-mail deve ser corporativo antes de avançar.</w:t>
+            </w:r>
+          </w:p>
+        </w:tc>
+        <w:tc>
+          <w:tcPr>
+            <w:tcW w:type="dxa" w:w="3600"/>
+            <w:vAlign w:val="center"/>
+          </w:tcPr>
+          <w:p>
+            <w:pPr>
+              <w:spacing w:after="0"/>
+            </w:pPr>
+            <w:r/>
+            <w:r>
+              <w:rPr>
+                <w:rFonts w:ascii="Arial" w:hAnsi="Arial"/>
+                <w:b w:val="0"/>
+                <w:color w:val="102A43"/>
+                <w:sz w:val="18"/>
+              </w:rPr>
+              <w:t>Protege a qualidade da base e reduz respostas fora do público-alvo.</w:t>
+            </w:r>
+          </w:p>
+        </w:tc>
+      </w:tr>
+      <w:tr>
+        <w:tc>
+          <w:tcPr>
+            <w:tcW w:type="dxa" w:w="1944"/>
+            <w:vAlign w:val="center"/>
+          </w:tcPr>
+          <w:p>
+            <w:pPr>
+              <w:spacing w:after="0"/>
+            </w:pPr>
+            <w:r/>
+            <w:r>
+              <w:rPr>
+                <w:rFonts w:ascii="Arial" w:hAnsi="Arial"/>
+                <w:b w:val="0"/>
+                <w:color w:val="102A43"/>
+                <w:sz w:val="18"/>
+              </w:rPr>
+              <w:t>Retomada</w:t>
+            </w:r>
+          </w:p>
+        </w:tc>
+        <w:tc>
+          <w:tcPr>
+            <w:tcW w:type="dxa" w:w="3816"/>
+            <w:vAlign w:val="center"/>
+          </w:tcPr>
+          <w:p>
+            <w:pPr>
+              <w:spacing w:after="0"/>
+            </w:pPr>
+            <w:r/>
+            <w:r>
+              <w:rPr>
+                <w:rFonts w:ascii="Arial" w:hAnsi="Arial"/>
+                <w:b w:val="0"/>
+                <w:color w:val="102A43"/>
+                <w:sz w:val="18"/>
+              </w:rPr>
+              <w:t>A pesquisa pública não deve bloquear por resposta antiga salva no navegador.</w:t>
+            </w:r>
+          </w:p>
+        </w:tc>
+        <w:tc>
+          <w:tcPr>
+            <w:tcW w:type="dxa" w:w="3600"/>
+            <w:vAlign w:val="center"/>
+          </w:tcPr>
+          <w:p>
+            <w:pPr>
+              <w:spacing w:after="0"/>
+            </w:pPr>
+            <w:r/>
+            <w:r>
+              <w:rPr>
+                <w:rFonts w:ascii="Arial" w:hAnsi="Arial"/>
+                <w:b w:val="0"/>
+                <w:color w:val="102A43"/>
+                <w:sz w:val="18"/>
+              </w:rPr>
+              <w:t>Evita falso positivo de conclusão em testes e acessos compartilhados.</w:t>
             </w:r>
           </w:p>
         </w:tc>

</xml_diff>

<commit_message>
Prepare SharePoint workbook integration
</commit_message>
<xml_diff>
--- a/deliverables/Prime_Control_NPS_Documentacao_Executiva_Tecnica.docx
+++ b/deliverables/Prime_Control_NPS_Documentacao_Executiva_Tecnica.docx
@@ -295,7 +295,7 @@
                 <w:color w:val="003F7D"/>
                 <w:sz w:val="22"/>
               </w:rPr>
-              <w:t>Multi-step</w:t>
+              <w:t>One-page</w:t>
             </w:r>
           </w:p>
         </w:tc>
@@ -331,7 +331,7 @@
                 <w:color w:val="003F7D"/>
                 <w:sz w:val="22"/>
               </w:rPr>
-              <w:t>Dashboard + planilha</w:t>
+              <w:t>Dashboard + CSV/Excel/PDF</w:t>
             </w:r>
           </w:p>
         </w:tc>
@@ -389,7 +389,7 @@
           <w:color w:val="5C6F82"/>
           <w:sz w:val="20"/>
         </w:rPr>
-        <w:t>Versão: 1.3 | Atualizado em: 22/05/2026</w:t>
+        <w:t>Versão: 1.4 | Atualizado em: 23/05/2026</w:t>
       </w:r>
     </w:p>
     <w:p>
@@ -739,7 +739,7 @@
           <w:color w:val="102A43"/>
           <w:sz w:val="20"/>
         </w:rPr>
-        <w:t>Usar experiência multi-step para reduzir sobrecarga cognitiva.</w:t>
+        <w:t>Tornar a versão em página única a experiência oficial da campanha, com leitura direta e responsiva.</w:t>
       </w:r>
     </w:p>
     <w:p>
@@ -754,7 +754,7 @@
           <w:color w:val="102A43"/>
           <w:sz w:val="20"/>
         </w:rPr>
-        <w:t>Salvar progresso e permitir retomada por controle interno invisível para o cliente.</w:t>
+        <w:t>Preservar a versão multi-step como backup técnico para comparação e contingência.</w:t>
       </w:r>
     </w:p>
     <w:p>
@@ -769,7 +769,7 @@
           <w:color w:val="102A43"/>
           <w:sz w:val="20"/>
         </w:rPr>
-        <w:t>Gerar planilha executiva e dashboard operacional com respostas e comportamento.</w:t>
+        <w:t>Gerar dashboard operacional e exportações em CSV, Excel visual e PDF executivo.</w:t>
       </w:r>
     </w:p>
     <w:p>
@@ -1183,7 +1183,7 @@
                 <w:color w:val="102A43"/>
                 <w:sz w:val="18"/>
               </w:rPr>
-              <w:t>Experiência multi-step, analytics, dashboard, planilha e integração com CRM.</w:t>
+              <w:t>Experiência one-page oficial, analytics, dashboard, exportações e integração com CRM.</w:t>
             </w:r>
           </w:p>
         </w:tc>
@@ -1561,7 +1561,7 @@
                 <w:color w:val="102A43"/>
                 <w:sz w:val="18"/>
               </w:rPr>
-              <w:t>Arquitetura multi-step e racional psicológico.</w:t>
+              <w:t>Arquitetura one-page oficial, backup multi-step e racional psicológico.</w:t>
             </w:r>
           </w:p>
         </w:tc>
@@ -2648,7 +2648,7 @@
                 <w:color w:val="102A43"/>
                 <w:sz w:val="20"/>
               </w:rPr>
-              <w:t>A pesquisa deve parecer menor do que é. Não reduzimos perguntas; reduzimos percepção de esforço por meio de etapas, progresso, salvamento e linguagem executiva.</w:t>
+              <w:t>A pesquisa deve ser direta, clara e executiva. Não reduzimos perguntas; reduzimos fricção por meio de página única, seções bem demarcadas, campos compactos, validação visual e linguagem neutra.</w:t>
             </w:r>
           </w:p>
         </w:tc>
@@ -2691,7 +2691,7 @@
         </w:trPr>
         <w:tc>
           <w:tcPr>
-            <w:tcW w:type="dxa" w:w="792"/>
+            <w:tcW w:type="dxa" w:w="1368"/>
             <w:shd w:fill="003F7D"/>
             <w:vAlign w:val="center"/>
           </w:tcPr>
@@ -2707,13 +2707,13 @@
                 <w:color w:val="FFFFFF"/>
                 <w:sz w:val="18"/>
               </w:rPr>
-              <w:t>Etapa</w:t>
-            </w:r>
-          </w:p>
-        </w:tc>
-        <w:tc>
-          <w:tcPr>
-            <w:tcW w:type="dxa" w:w="3240"/>
+              <w:t>Bloco</w:t>
+            </w:r>
+          </w:p>
+        </w:tc>
+        <w:tc>
+          <w:tcPr>
+            <w:tcW w:type="dxa" w:w="3384"/>
             <w:shd w:fill="003F7D"/>
             <w:vAlign w:val="center"/>
           </w:tcPr>
@@ -2729,13 +2729,13 @@
                 <w:color w:val="FFFFFF"/>
                 <w:sz w:val="18"/>
               </w:rPr>
-              <w:t>Nome</w:t>
-            </w:r>
-          </w:p>
-        </w:tc>
-        <w:tc>
-          <w:tcPr>
-            <w:tcW w:type="dxa" w:w="5328"/>
+              <w:t>Conteúdo</w:t>
+            </w:r>
+          </w:p>
+        </w:tc>
+        <w:tc>
+          <w:tcPr>
+            <w:tcW w:type="dxa" w:w="4608"/>
             <w:shd w:fill="003F7D"/>
             <w:vAlign w:val="center"/>
           </w:tcPr>
@@ -2759,7 +2759,7 @@
       <w:tr>
         <w:tc>
           <w:tcPr>
-            <w:tcW w:type="dxa" w:w="792"/>
+            <w:tcW w:type="dxa" w:w="1368"/>
             <w:vAlign w:val="center"/>
           </w:tcPr>
           <w:p>
@@ -2774,13 +2774,13 @@
                 <w:color w:val="102A43"/>
                 <w:sz w:val="18"/>
               </w:rPr>
-              <w:t>0</w:t>
-            </w:r>
-          </w:p>
-        </w:tc>
-        <w:tc>
-          <w:tcPr>
-            <w:tcW w:type="dxa" w:w="3240"/>
+              <w:t>Topo</w:t>
+            </w:r>
+          </w:p>
+        </w:tc>
+        <w:tc>
+          <w:tcPr>
+            <w:tcW w:type="dxa" w:w="3384"/>
             <w:vAlign w:val="center"/>
           </w:tcPr>
           <w:p>
@@ -2795,13 +2795,13 @@
                 <w:color w:val="102A43"/>
                 <w:sz w:val="18"/>
               </w:rPr>
-              <w:t>Landing</w:t>
-            </w:r>
-          </w:p>
-        </w:tc>
-        <w:tc>
-          <w:tcPr>
-            <w:tcW w:type="dxa" w:w="5328"/>
+              <w:t>Título e contexto</w:t>
+            </w:r>
+          </w:p>
+        </w:tc>
+        <w:tc>
+          <w:tcPr>
+            <w:tcW w:type="dxa" w:w="4608"/>
             <w:vAlign w:val="center"/>
           </w:tcPr>
           <w:p>
@@ -2816,7 +2816,7 @@
                 <w:color w:val="102A43"/>
                 <w:sz w:val="18"/>
               </w:rPr>
-              <w:t>Propósito, tempo estimado, confiança e CTA.</w:t>
+              <w:t>Pesquisa de Satisfação | NPS | Maio 2026, tempo estimado e validade.</w:t>
             </w:r>
           </w:p>
         </w:tc>
@@ -2824,7 +2824,7 @@
       <w:tr>
         <w:tc>
           <w:tcPr>
-            <w:tcW w:type="dxa" w:w="792"/>
+            <w:tcW w:type="dxa" w:w="1368"/>
             <w:vAlign w:val="center"/>
           </w:tcPr>
           <w:p>
@@ -2839,13 +2839,13 @@
                 <w:color w:val="102A43"/>
                 <w:sz w:val="18"/>
               </w:rPr>
-              <w:t>1</w:t>
-            </w:r>
-          </w:p>
-        </w:tc>
-        <w:tc>
-          <w:tcPr>
-            <w:tcW w:type="dxa" w:w="3240"/>
+              <w:t>Identificação</w:t>
+            </w:r>
+          </w:p>
+        </w:tc>
+        <w:tc>
+          <w:tcPr>
+            <w:tcW w:type="dxa" w:w="3384"/>
             <w:vAlign w:val="center"/>
           </w:tcPr>
           <w:p>
@@ -2860,13 +2860,13 @@
                 <w:color w:val="102A43"/>
                 <w:sz w:val="18"/>
               </w:rPr>
-              <w:t>Identificação</w:t>
-            </w:r>
-          </w:p>
-        </w:tc>
-        <w:tc>
-          <w:tcPr>
-            <w:tcW w:type="dxa" w:w="5328"/>
+              <w:t>Nome, e-mail corporativo, empresa e cargo</w:t>
+            </w:r>
+          </w:p>
+        </w:tc>
+        <w:tc>
+          <w:tcPr>
+            <w:tcW w:type="dxa" w:w="4608"/>
             <w:vAlign w:val="center"/>
           </w:tcPr>
           <w:p>
@@ -2881,7 +2881,7 @@
                 <w:color w:val="102A43"/>
                 <w:sz w:val="18"/>
               </w:rPr>
-              <w:t>Dados pré-preenchidos via HubSpot e controle interno.</w:t>
+              <w:t>Campo Área removido para reduzir esforço; e-mail com validação visual.</w:t>
             </w:r>
           </w:p>
         </w:tc>
@@ -2889,7 +2889,7 @@
       <w:tr>
         <w:tc>
           <w:tcPr>
-            <w:tcW w:type="dxa" w:w="792"/>
+            <w:tcW w:type="dxa" w:w="1368"/>
             <w:vAlign w:val="center"/>
           </w:tcPr>
           <w:p>
@@ -2910,7 +2910,7 @@
         </w:tc>
         <w:tc>
           <w:tcPr>
-            <w:tcW w:type="dxa" w:w="3240"/>
+            <w:tcW w:type="dxa" w:w="3384"/>
             <w:vAlign w:val="center"/>
           </w:tcPr>
           <w:p>
@@ -2931,7 +2931,7 @@
         </w:tc>
         <w:tc>
           <w:tcPr>
-            <w:tcW w:type="dxa" w:w="5328"/>
+            <w:tcW w:type="dxa" w:w="4608"/>
             <w:vAlign w:val="center"/>
           </w:tcPr>
           <w:p>
@@ -2954,7 +2954,7 @@
       <w:tr>
         <w:tc>
           <w:tcPr>
-            <w:tcW w:type="dxa" w:w="792"/>
+            <w:tcW w:type="dxa" w:w="1368"/>
             <w:vAlign w:val="center"/>
           </w:tcPr>
           <w:p>
@@ -2975,7 +2975,7 @@
         </w:tc>
         <w:tc>
           <w:tcPr>
-            <w:tcW w:type="dxa" w:w="3240"/>
+            <w:tcW w:type="dxa" w:w="3384"/>
             <w:vAlign w:val="center"/>
           </w:tcPr>
           <w:p>
@@ -2996,7 +2996,7 @@
         </w:tc>
         <w:tc>
           <w:tcPr>
-            <w:tcW w:type="dxa" w:w="5328"/>
+            <w:tcW w:type="dxa" w:w="4608"/>
             <w:vAlign w:val="center"/>
           </w:tcPr>
           <w:p>
@@ -3019,7 +3019,7 @@
       <w:tr>
         <w:tc>
           <w:tcPr>
-            <w:tcW w:type="dxa" w:w="792"/>
+            <w:tcW w:type="dxa" w:w="1368"/>
             <w:vAlign w:val="center"/>
           </w:tcPr>
           <w:p>
@@ -3040,7 +3040,7 @@
         </w:tc>
         <w:tc>
           <w:tcPr>
-            <w:tcW w:type="dxa" w:w="3240"/>
+            <w:tcW w:type="dxa" w:w="3384"/>
             <w:vAlign w:val="center"/>
           </w:tcPr>
           <w:p>
@@ -3061,7 +3061,7 @@
         </w:tc>
         <w:tc>
           <w:tcPr>
-            <w:tcW w:type="dxa" w:w="5328"/>
+            <w:tcW w:type="dxa" w:w="4608"/>
             <w:vAlign w:val="center"/>
           </w:tcPr>
           <w:p>
@@ -3084,7 +3084,7 @@
       <w:tr>
         <w:tc>
           <w:tcPr>
-            <w:tcW w:type="dxa" w:w="792"/>
+            <w:tcW w:type="dxa" w:w="1368"/>
             <w:vAlign w:val="center"/>
           </w:tcPr>
           <w:p>
@@ -3099,13 +3099,13 @@
                 <w:color w:val="102A43"/>
                 <w:sz w:val="18"/>
               </w:rPr>
-              <w:t>5</w:t>
-            </w:r>
-          </w:p>
-        </w:tc>
-        <w:tc>
-          <w:tcPr>
-            <w:tcW w:type="dxa" w:w="3240"/>
+              <w:t>4</w:t>
+            </w:r>
+          </w:p>
+        </w:tc>
+        <w:tc>
+          <w:tcPr>
+            <w:tcW w:type="dxa" w:w="3384"/>
             <w:vAlign w:val="center"/>
           </w:tcPr>
           <w:p>
@@ -3126,7 +3126,7 @@
         </w:tc>
         <w:tc>
           <w:tcPr>
-            <w:tcW w:type="dxa" w:w="5328"/>
+            <w:tcW w:type="dxa" w:w="4608"/>
             <w:vAlign w:val="center"/>
           </w:tcPr>
           <w:p>
@@ -3141,7 +3141,7 @@
                 <w:color w:val="102A43"/>
                 <w:sz w:val="18"/>
               </w:rPr>
-              <w:t>Última etapa com visão estratégica e campos abertos.</w:t>
+              <w:t>Percepção de inovação e oportunidades futuras.</w:t>
             </w:r>
           </w:p>
         </w:tc>
@@ -3149,7 +3149,7 @@
       <w:tr>
         <w:tc>
           <w:tcPr>
-            <w:tcW w:type="dxa" w:w="792"/>
+            <w:tcW w:type="dxa" w:w="1368"/>
             <w:vAlign w:val="center"/>
           </w:tcPr>
           <w:p>
@@ -3164,13 +3164,13 @@
                 <w:color w:val="102A43"/>
                 <w:sz w:val="18"/>
               </w:rPr>
-              <w:t>6</w:t>
-            </w:r>
-          </w:p>
-        </w:tc>
-        <w:tc>
-          <w:tcPr>
-            <w:tcW w:type="dxa" w:w="3240"/>
+              <w:t>Backup</w:t>
+            </w:r>
+          </w:p>
+        </w:tc>
+        <w:tc>
+          <w:tcPr>
+            <w:tcW w:type="dxa" w:w="3384"/>
             <w:vAlign w:val="center"/>
           </w:tcPr>
           <w:p>
@@ -3185,13 +3185,13 @@
                 <w:color w:val="102A43"/>
                 <w:sz w:val="18"/>
               </w:rPr>
-              <w:t>Conclusão</w:t>
-            </w:r>
-          </w:p>
-        </w:tc>
-        <w:tc>
-          <w:tcPr>
-            <w:tcW w:type="dxa" w:w="5328"/>
+              <w:t>Fluxo multi-step preservado</w:t>
+            </w:r>
+          </w:p>
+        </w:tc>
+        <w:tc>
+          <w:tcPr>
+            <w:tcW w:type="dxa" w:w="4608"/>
             <w:vAlign w:val="center"/>
           </w:tcPr>
           <w:p>
@@ -3206,7 +3206,7 @@
                 <w:color w:val="102A43"/>
                 <w:sz w:val="18"/>
               </w:rPr>
-              <w:t>Confirmação executiva e encerramento.</w:t>
+              <w:t>Rota de contingência para comparação futura.</w:t>
             </w:r>
           </w:p>
         </w:tc>
@@ -3244,7 +3244,7 @@
           <w:color w:val="102A43"/>
           <w:sz w:val="20"/>
         </w:rPr>
-        <w:t>Chunking: blocos menores reduzem sobrecarga cognitiva.</w:t>
+        <w:t>Uma página reduz transições e funciona bem para clientes que preferem objetividade.</w:t>
       </w:r>
     </w:p>
     <w:p>
@@ -3259,7 +3259,7 @@
           <w:color w:val="102A43"/>
           <w:sz w:val="20"/>
         </w:rPr>
-        <w:t>Goal gradient effect: progresso visível aumenta motivação para concluir.</w:t>
+        <w:t>Seções e perguntas numeradas facilitam orientação sem numerar os títulos.</w:t>
       </w:r>
     </w:p>
     <w:p>
@@ -3274,7 +3274,7 @@
           <w:color w:val="102A43"/>
           <w:sz w:val="20"/>
         </w:rPr>
-        <w:t>Perceived control: autosave e retomada reduzem ansiedade.</w:t>
+        <w:t>Validação visual imediata reduz erro no envio e frustração no fim do preenchimento.</w:t>
       </w:r>
     </w:p>
     <w:p>
@@ -3333,7 +3333,7 @@
           <w:color w:val="102A43"/>
           <w:sz w:val="21"/>
         </w:rPr>
-        <w:t>A escala deve ser apresentada visualmente de forma crescente, da esquerda para a direita. Para NPS, o padrão mais reconhecido é 0 a 10; para perguntas de satisfação, quando a metodologia aprovada usa 1 a 10, a apresentação recomendada é 1 a 10.</w:t>
+        <w:t>A decisão metodológica preferencial é manter a escala clara e neutra. A versão oficial atual segue a referência visual aprovada pela área, com quadradinhos de 10 a 1 ao lado da pergunta; esse ponto deve ser monitorado em analytics para confirmar se não aumenta erro de clique ou hesitação.</w:t>
       </w:r>
     </w:p>
     <w:tbl>
@@ -3451,7 +3451,7 @@
                 <w:color w:val="102A43"/>
                 <w:sz w:val="18"/>
               </w:rPr>
-              <w:t>1 → 10 ou 0 → 10</w:t>
+              <w:t>10 → 1</w:t>
             </w:r>
           </w:p>
         </w:tc>
@@ -3472,7 +3472,7 @@
                 <w:color w:val="102A43"/>
                 <w:sz w:val="18"/>
               </w:rPr>
-              <w:t>Fluxo mental natural de leitura</w:t>
+              <w:t>Formato atual da interface oficial</w:t>
             </w:r>
           </w:p>
         </w:tc>
@@ -3493,7 +3493,7 @@
                 <w:color w:val="102A43"/>
                 <w:sz w:val="18"/>
               </w:rPr>
-              <w:t>Reduz erro de clique e transmite neutralidade.</w:t>
+              <w:t>Mantém alinhamento com a referência de planilha/GPTW enviada.</w:t>
             </w:r>
           </w:p>
         </w:tc>
@@ -3516,7 +3516,7 @@
                 <w:color w:val="102A43"/>
                 <w:sz w:val="18"/>
               </w:rPr>
-              <w:t>10 → 1 ou 10 → 0</w:t>
+              <w:t>1 → 10</w:t>
             </w:r>
           </w:p>
         </w:tc>
@@ -3537,7 +3537,7 @@
                 <w:color w:val="102A43"/>
                 <w:sz w:val="18"/>
               </w:rPr>
-              <w:t>Ordem invertida</w:t>
+              <w:t>Alternativa metodologicamente mais natural para leitura</w:t>
             </w:r>
           </w:p>
         </w:tc>
@@ -3558,7 +3558,7 @@
                 <w:color w:val="102A43"/>
                 <w:sz w:val="18"/>
               </w:rPr>
-              <w:t>Aumenta carga cognitiva, pode parecer indução à nota alta e prejudica mobile.</w:t>
+              <w:t>Pode ser testada depois, se houver indício de erro, hesitação ou confusão.</w:t>
             </w:r>
           </w:p>
         </w:tc>
@@ -3936,7 +3936,7 @@
                 <w:color w:val="102A43"/>
                 <w:sz w:val="18"/>
               </w:rPr>
-              <w:t>Landing leve, sem expor todas as perguntas.</w:t>
+              <w:t>Acesso direto à pesquisa oficial na raiz do site.</w:t>
             </w:r>
           </w:p>
         </w:tc>
@@ -4001,7 +4001,7 @@
                 <w:color w:val="102A43"/>
                 <w:sz w:val="18"/>
               </w:rPr>
-              <w:t>CTA claro e promessa de 3 a 5 minutos.</w:t>
+              <w:t>Tempo estimado visível e perguntas em uma página.</w:t>
             </w:r>
           </w:p>
         </w:tc>
@@ -4066,7 +4066,7 @@
                 <w:color w:val="102A43"/>
                 <w:sz w:val="18"/>
               </w:rPr>
-              <w:t>Pré-preenchimento via HubSpot.</w:t>
+              <w:t>Apenas nome, e-mail corporativo, empresa e cargo.</w:t>
             </w:r>
           </w:p>
         </w:tc>
@@ -4908,7 +4908,7 @@
                 <w:color w:val="102A43"/>
                 <w:sz w:val="18"/>
               </w:rPr>
-              <w:t>Respostas, sessões, identificação interna, progresso e eventos.</w:t>
+              <w:t>Respostas, sessões, identificação interna e eventos.</w:t>
             </w:r>
           </w:p>
         </w:tc>
@@ -5017,7 +5017,7 @@
                 <w:color w:val="102A43"/>
                 <w:sz w:val="18"/>
               </w:rPr>
-              <w:t>Planilha</w:t>
+              <w:t>Exportações</w:t>
             </w:r>
           </w:p>
         </w:tc>
@@ -5038,7 +5038,7 @@
                 <w:color w:val="102A43"/>
                 <w:sz w:val="18"/>
               </w:rPr>
-              <w:t>CSV/XLSX de respostas e comportamento.</w:t>
+              <w:t>CSV, Excel visual em tons de cinza e PDF executivo.</w:t>
             </w:r>
           </w:p>
         </w:tc>
@@ -6112,7 +6112,7 @@
           <w:color w:val="102A43"/>
           <w:sz w:val="21"/>
         </w:rPr>
-        <w:t>A exportação CSV/XLSX deve conter respostas e sinais comportamentais, não apenas nota final.</w:t>
+        <w:t>As exportações CSV, Excel e PDF devem conter respostas, indicadores e sinais comportamentais, não apenas nota final. Para a planilha oficial em OneDrive/SharePoint, a recomendação é manter o Supabase como base principal e atualizar uma aba chamada Base automática via Microsoft Graph API. O link real da planilha deve ficar apenas em variável de ambiente, pois o repositório do projeto é público.</w:t>
       </w:r>
     </w:p>
     <w:p>
@@ -6127,7 +6127,7 @@
           <w:color w:val="102A43"/>
           <w:sz w:val="20"/>
         </w:rPr>
-        <w:t>Identificação: empresa, contato, cargo, área e campaign_id.</w:t>
+        <w:t>Identificação: empresa, contato, cargo e campaign_id.</w:t>
       </w:r>
     </w:p>
     <w:p>
@@ -6188,6 +6188,21 @@
           <w:sz w:val="20"/>
         </w:rPr>
         <w:t>Qualidade: campos abertos preenchidos, tamanho de comentário e resposta parcial.</w:t>
+      </w:r>
+    </w:p>
+    <w:p>
+      <w:pPr>
+        <w:pStyle w:val="ListBullet"/>
+        <w:spacing w:after="60" w:line="269" w:lineRule="auto"/>
+        <w:ind w:left="360"/>
+      </w:pPr>
+      <w:r>
+        <w:rPr>
+          <w:rFonts w:ascii="Arial" w:hAnsi="Arial"/>
+          <w:color w:val="102A43"/>
+          <w:sz w:val="20"/>
+        </w:rPr>
+        <w:t>Excel corporativo: arquivo Respostas NPS 2026 no SharePoint/OneDrive, com aba Base automática e tabela técnica TabelaRespostasNPS para integração, além de abas separadas para resumo executivo, dicionário e configurações.</w:t>
       </w:r>
     </w:p>
     <w:p>
@@ -6869,7 +6884,7 @@
                 <w:color w:val="102A43"/>
                 <w:sz w:val="18"/>
               </w:rPr>
-              <w:t>Next.js, TypeScript, Tailwind, Shadcn UI</w:t>
+              <w:t>Next.js e TypeScript</w:t>
             </w:r>
           </w:p>
         </w:tc>
@@ -6890,7 +6905,7 @@
                 <w:color w:val="102A43"/>
                 <w:sz w:val="18"/>
               </w:rPr>
-              <w:t>Experiência multi-step responsiva.</w:t>
+              <w:t>Experiência one-page responsiva, com backup multi-step.</w:t>
             </w:r>
           </w:p>
         </w:tc>
@@ -7253,7 +7268,7 @@
           <w:color w:val="102A43"/>
           <w:sz w:val="20"/>
         </w:rPr>
-        <w:t>/: landing pública da campanha.</w:t>
+        <w:t>/: pesquisa oficial em página única.</w:t>
       </w:r>
     </w:p>
     <w:p>
@@ -7268,7 +7283,52 @@
           <w:color w:val="102A43"/>
           <w:sz w:val="20"/>
         </w:rPr>
-        <w:t>/survey: wizard da pesquisa.</w:t>
+        <w:t>/survey: caminho direto alternativo para a mesma pesquisa.</w:t>
+      </w:r>
+    </w:p>
+    <w:p>
+      <w:pPr>
+        <w:pStyle w:val="ListBullet"/>
+        <w:spacing w:after="60" w:line="269" w:lineRule="auto"/>
+        <w:ind w:left="360"/>
+      </w:pPr>
+      <w:r>
+        <w:rPr>
+          <w:rFonts w:ascii="Arial" w:hAnsi="Arial"/>
+          <w:color w:val="102A43"/>
+          <w:sz w:val="20"/>
+        </w:rPr>
+        <w:t>/survey-classic: alias da experiência one-page.</w:t>
+      </w:r>
+    </w:p>
+    <w:p>
+      <w:pPr>
+        <w:pStyle w:val="ListBullet"/>
+        <w:spacing w:after="60" w:line="269" w:lineRule="auto"/>
+        <w:ind w:left="360"/>
+      </w:pPr>
+      <w:r>
+        <w:rPr>
+          <w:rFonts w:ascii="Arial" w:hAnsi="Arial"/>
+          <w:color w:val="102A43"/>
+          <w:sz w:val="20"/>
+        </w:rPr>
+        <w:t>/survey-backup: backup do fluxo multi-step.</w:t>
+      </w:r>
+    </w:p>
+    <w:p>
+      <w:pPr>
+        <w:pStyle w:val="ListBullet"/>
+        <w:spacing w:after="60" w:line="269" w:lineRule="auto"/>
+        <w:ind w:left="360"/>
+      </w:pPr>
+      <w:r>
+        <w:rPr>
+          <w:rFonts w:ascii="Arial" w:hAnsi="Arial"/>
+          <w:color w:val="102A43"/>
+          <w:sz w:val="20"/>
+        </w:rPr>
+        <w:t>/landing-backup: backup da landing anterior.</w:t>
       </w:r>
     </w:p>
     <w:p>
@@ -7298,7 +7358,7 @@
           <w:color w:val="102A43"/>
           <w:sz w:val="20"/>
         </w:rPr>
-        <w:t>Componentes: SurveyLayout, ProgressBar, RatingScale, OpenTextQuestion, AutosaveIndicator, ResumeBanner e CompletionState.</w:t>
+        <w:t>Componentes: ClassicSurveyExperience, RatingScale, campos de identificação, validação visual, exportações e dashboard.</w:t>
       </w:r>
     </w:p>
     <w:p>
@@ -7987,7 +8047,7 @@
                 <w:color w:val="102A43"/>
                 <w:sz w:val="18"/>
               </w:rPr>
-              <w:t>Landing, wizard, controle interno, autosave, retomada e persistência.</w:t>
+              <w:t>Pesquisa one-page oficial, backup multi-step, controle interno e persistência.</w:t>
             </w:r>
           </w:p>
         </w:tc>
@@ -8096,7 +8156,7 @@
                 <w:color w:val="102A43"/>
                 <w:sz w:val="18"/>
               </w:rPr>
-              <w:t>Dashboard e planilha</w:t>
+              <w:t>Dashboard e exportações</w:t>
             </w:r>
           </w:p>
         </w:tc>
@@ -8117,7 +8177,7 @@
                 <w:color w:val="102A43"/>
                 <w:sz w:val="18"/>
               </w:rPr>
-              <w:t>Funil, abandono, clientes silenciosos e exportação CSV/XLSX.</w:t>
+              <w:t>Funil, abandono, clientes silenciosos, exportação CSV/Excel/PDF e modelo oficial de planilha SharePoint.</w:t>
             </w:r>
           </w:p>
         </w:tc>
@@ -8380,7 +8440,7 @@
           <w:color w:val="102A43"/>
           <w:sz w:val="20"/>
         </w:rPr>
-        <w:t>Gerar exportação CSV/XLSX.</w:t>
+        <w:t>Gerar exportações CSV, Excel visual, PDF executivo e modelo oficial para OneDrive/SharePoint.</w:t>
       </w:r>
     </w:p>
     <w:p>
@@ -8834,7 +8894,7 @@
           <w:color w:val="102A43"/>
           <w:sz w:val="21"/>
         </w:rPr>
-        <w:t>A primeira versão navegável já foi criada para validar a experiência do respondente e agora possui uma camada funcional de dados, dashboard interno, Clarity, exportação CSV e estados controlados para acessos incorretos.</w:t>
+        <w:t>A primeira versão navegável já foi criada para validar a experiência do respondente e agora possui pesquisa oficial em página única, camada funcional de dados, dashboard interno, Clarity, exportações CSV/Excel/PDF e estados controlados para acessos incorretos.</w:t>
       </w:r>
     </w:p>
     <w:tbl>
@@ -8950,7 +9010,7 @@
                 <w:color w:val="102A43"/>
                 <w:sz w:val="18"/>
               </w:rPr>
-              <w:t>Next.js, landing compacta, fluxo multi-step, perguntas preservadas, autosave, APIs internas, Supabase preparado, dashboard interno protegido, exportação CSV, logo, identidade visual, Clarity e estados controlados para erro/link inválido.</w:t>
+              <w:t>Next.js, pesquisa one-page oficial na raiz, perguntas preservadas, perguntas numeradas, identificação simplificada, validação visual de e-mail corporativo, APIs internas, Supabase preparado, dashboard interno protegido, exportações CSV/Excel/PDF, logo, identidade visual, Clarity e backups de landing/multi-step.</w:t>
             </w:r>
           </w:p>
         </w:tc>
@@ -8994,7 +9054,7 @@
                 <w:color w:val="102A43"/>
                 <w:sz w:val="18"/>
               </w:rPr>
-              <w:t>Importação oficial de respondentes, XLSX, HubSpot, PostHog, GA4, subdomínio nps.primecontrol.com.br, refinamento final do dashboard e validação de campanha.</w:t>
+              <w:t>Importação oficial de respondentes, integração HubSpot, integração Microsoft Graph com SharePoint/OneDrive, PostHog, GA4, subdomínio nps.primecontrol.com.br, refinamento final do dashboard e validação de campanha.</w:t>
             </w:r>
           </w:p>
         </w:tc>
@@ -9076,7 +9136,7 @@
           <w:color w:val="102A43"/>
           <w:sz w:val="20"/>
         </w:rPr>
-        <w:t>Raiz da plataforma: http://localhost:3000</w:t>
+        <w:t>Raiz da plataforma e pesquisa oficial: http://localhost:3000</w:t>
       </w:r>
     </w:p>
     <w:p>
@@ -9091,7 +9151,7 @@
           <w:color w:val="102A43"/>
           <w:sz w:val="20"/>
         </w:rPr>
-        <w:t>Landing do respondente: http://localhost:3000/nps/demo-prime-control</w:t>
+        <w:t>Pesquisa oficial alternativa: http://localhost:3000/survey</w:t>
       </w:r>
     </w:p>
     <w:p>
@@ -9106,7 +9166,22 @@
           <w:color w:val="102A43"/>
           <w:sz w:val="20"/>
         </w:rPr>
-        <w:t>Pesquisa multi-step: http://localhost:3000/nps/demo-prime-control/survey</w:t>
+        <w:t>Backup multi-step: http://localhost:3000/survey-backup</w:t>
+      </w:r>
+    </w:p>
+    <w:p>
+      <w:pPr>
+        <w:pStyle w:val="ListBullet"/>
+        <w:spacing w:after="60" w:line="269" w:lineRule="auto"/>
+        <w:ind w:left="360"/>
+      </w:pPr>
+      <w:r>
+        <w:rPr>
+          <w:rFonts w:ascii="Arial" w:hAnsi="Arial"/>
+          <w:color w:val="102A43"/>
+          <w:sz w:val="20"/>
+        </w:rPr>
+        <w:t>Backup landing: http://localhost:3000/landing-backup</w:t>
       </w:r>
     </w:p>
     <w:p>
@@ -9141,6 +9216,36 @@
     </w:p>
     <w:p>
       <w:pPr>
+        <w:pStyle w:val="ListBullet"/>
+        <w:spacing w:after="60" w:line="269" w:lineRule="auto"/>
+        <w:ind w:left="360"/>
+      </w:pPr>
+      <w:r>
+        <w:rPr>
+          <w:rFonts w:ascii="Arial" w:hAnsi="Arial"/>
+          <w:color w:val="102A43"/>
+          <w:sz w:val="20"/>
+        </w:rPr>
+        <w:t>Exportação Excel: http://localhost:3000/api/admin/export.xls</w:t>
+      </w:r>
+    </w:p>
+    <w:p>
+      <w:pPr>
+        <w:pStyle w:val="ListBullet"/>
+        <w:spacing w:after="60" w:line="269" w:lineRule="auto"/>
+        <w:ind w:left="360"/>
+      </w:pPr>
+      <w:r>
+        <w:rPr>
+          <w:rFonts w:ascii="Arial" w:hAnsi="Arial"/>
+          <w:color w:val="102A43"/>
+          <w:sz w:val="20"/>
+        </w:rPr>
+        <w:t>Exportação PDF: http://localhost:3000/api/admin/export.pdf</w:t>
+      </w:r>
+    </w:p>
+    <w:p>
+      <w:pPr>
         <w:pStyle w:val="Heading1"/>
         <w:keepNext/>
       </w:pPr>
@@ -9165,7 +9270,7 @@
           <w:color w:val="102A43"/>
           <w:sz w:val="21"/>
         </w:rPr>
-        <w:t>A plataforma deixou de ser apenas um protótipo visual e passou a operar como MVP funcional, com experiência pública, persistência de dados, dashboard interno protegido, exportação CSV e integração preparada com Microsoft Clarity.</w:t>
+        <w:t>A plataforma deixou de ser apenas um protótipo visual e passou a operar como MVP funcional, com experiência pública one-page, persistência de dados, dashboard interno protegido, exportações CSV/Excel/PDF e integração preparada com Microsoft Clarity.</w:t>
       </w:r>
     </w:p>
     <w:tbl>
@@ -9369,7 +9474,7 @@
                 <w:color w:val="102A43"/>
                 <w:sz w:val="18"/>
               </w:rPr>
-              <w:t>Visão de convidados, participação, conclusão, abandono, NPS parcial, score de fricção, clientes silenciosos e exportação.</w:t>
+              <w:t>Visão de convidados, participação, conclusão, abandono, NPS parcial, score de fricção, clientes silenciosos e exportações.</w:t>
             </w:r>
           </w:p>
         </w:tc>
@@ -9392,7 +9497,7 @@
                 <w:color w:val="102A43"/>
                 <w:sz w:val="18"/>
               </w:rPr>
-              <w:t>Exportação CSV</w:t>
+              <w:t>Exportações</w:t>
             </w:r>
           </w:p>
         </w:tc>
@@ -9413,7 +9518,7 @@
                 <w:color w:val="102A43"/>
                 <w:sz w:val="18"/>
               </w:rPr>
-              <w:t>Arquivo com identificação, status, datas, etapa e respostas.</w:t>
+              <w:t>CSV bruto, Excel visual em tons de cinza, PDF executivo resumido e modelo oficial de planilha SharePoint/OneDrive com tabela TabelaRespostasNPS.</w:t>
             </w:r>
           </w:p>
         </w:tc>
@@ -9627,7 +9732,7 @@
                 <w:color w:val="102A43"/>
                 <w:sz w:val="20"/>
               </w:rPr>
-              <w:t>Manter a experiência pública direta, leve e executiva. A tela inicial deve caber na primeira dobra sempre que possível, sem parecer uma landing pesada ou uma tela técnica.</w:t>
+              <w:t>Manter a experiência pública direta, leve e executiva. A raiz do site deve abrir a pesquisa oficial em página única, sem landing intermediária e sem informações técnicas internas.</w:t>
             </w:r>
           </w:p>
         </w:tc>
@@ -9753,7 +9858,7 @@
                 <w:color w:val="102A43"/>
                 <w:sz w:val="18"/>
               </w:rPr>
-              <w:t>Tela inicial</w:t>
+              <w:t>Tela oficial</w:t>
             </w:r>
           </w:p>
         </w:tc>
@@ -9774,7 +9879,7 @@
                 <w:color w:val="102A43"/>
                 <w:sz w:val="18"/>
               </w:rPr>
-              <w:t>Removido bloco lateral de 3 a 5 minutos; a informação permanece no topo.</w:t>
+              <w:t>A raiz do site abre diretamente a versão one-page da pesquisa.</w:t>
             </w:r>
           </w:p>
         </w:tc>
@@ -9795,7 +9900,7 @@
                 <w:color w:val="102A43"/>
                 <w:sz w:val="18"/>
               </w:rPr>
-              <w:t>Evita redundância e melhora fluidez visual.</w:t>
+              <w:t>Reduz fricção e elimina etapa intermediária.</w:t>
             </w:r>
           </w:p>
         </w:tc>
@@ -9839,7 +9944,7 @@
                 <w:color w:val="102A43"/>
                 <w:sz w:val="18"/>
               </w:rPr>
-              <w:t>Prazo de validade exibido como nota discreta: 01/06/2026.</w:t>
+              <w:t>Prazo de validade exibido no topo: 01/06/2026.</w:t>
             </w:r>
           </w:p>
         </w:tc>
@@ -9860,7 +9965,7 @@
                 <w:color w:val="102A43"/>
                 <w:sz w:val="18"/>
               </w:rPr>
-              <w:t>Cria senso de período ativo sem competir com o CTA.</w:t>
+              <w:t>Deixa claro o período ativo da campanha.</w:t>
             </w:r>
           </w:p>
         </w:tc>
@@ -9883,7 +9988,7 @@
                 <w:color w:val="102A43"/>
                 <w:sz w:val="18"/>
               </w:rPr>
-              <w:t>Blocos de confiança</w:t>
+              <w:t>Seções</w:t>
             </w:r>
           </w:p>
         </w:tc>
@@ -9904,7 +10009,7 @@
                 <w:color w:val="102A43"/>
                 <w:sz w:val="18"/>
               </w:rPr>
-              <w:t>Mantidos três cards: Rápida, Responsável e Retomável.</w:t>
+              <w:t>Títulos sem numeração; perguntas numeradas de forma discreta.</w:t>
             </w:r>
           </w:p>
         </w:tc>
@@ -9925,7 +10030,7 @@
                 <w:color w:val="102A43"/>
                 <w:sz w:val="18"/>
               </w:rPr>
-              <w:t>Preserva clareza e reduz ruído visual.</w:t>
+              <w:t>Facilita referência e leitura sem poluir a hierarquia.</w:t>
             </w:r>
           </w:p>
         </w:tc>
@@ -10013,7 +10118,7 @@
                 <w:color w:val="102A43"/>
                 <w:sz w:val="18"/>
               </w:rPr>
-              <w:t>Validação</w:t>
+              <w:t>Identificação</w:t>
             </w:r>
           </w:p>
         </w:tc>
@@ -10034,7 +10139,7 @@
                 <w:color w:val="102A43"/>
                 <w:sz w:val="18"/>
               </w:rPr>
-              <w:t>E-mail deve ser corporativo antes de avançar.</w:t>
+              <w:t>Campo Área removido; Cargo permanece.</w:t>
             </w:r>
           </w:p>
         </w:tc>
@@ -10055,7 +10160,7 @@
                 <w:color w:val="102A43"/>
                 <w:sz w:val="18"/>
               </w:rPr>
-              <w:t>Protege a qualidade da base e reduz respostas fora do público-alvo.</w:t>
+              <w:t>Reduz esforço sem perda relevante para segmentação operacional.</w:t>
             </w:r>
           </w:p>
         </w:tc>
@@ -10078,7 +10183,7 @@
                 <w:color w:val="102A43"/>
                 <w:sz w:val="18"/>
               </w:rPr>
-              <w:t>Retomada</w:t>
+              <w:t>Validação</w:t>
             </w:r>
           </w:p>
         </w:tc>
@@ -10099,7 +10204,7 @@
                 <w:color w:val="102A43"/>
                 <w:sz w:val="18"/>
               </w:rPr>
-              <w:t>A pesquisa pública não deve bloquear por resposta antiga salva no navegador.</w:t>
+              <w:t>E-mail corporativo exibe feedback visual imediato quando inválido ou pessoal.</w:t>
             </w:r>
           </w:p>
         </w:tc>
@@ -10120,7 +10225,7 @@
                 <w:color w:val="102A43"/>
                 <w:sz w:val="18"/>
               </w:rPr>
-              <w:t>Evita falso positivo de conclusão em testes e acessos compartilhados.</w:t>
+              <w:t>Protege qualidade da base e reduz erro apenas no fim do envio.</w:t>
             </w:r>
           </w:p>
         </w:tc>
@@ -10143,7 +10248,7 @@
                 <w:color w:val="102A43"/>
                 <w:sz w:val="18"/>
               </w:rPr>
-              <w:t>Tom</w:t>
+              <w:t>Exportações</w:t>
             </w:r>
           </w:p>
         </w:tc>
@@ -10164,7 +10269,7 @@
                 <w:color w:val="102A43"/>
                 <w:sz w:val="18"/>
               </w:rPr>
-              <w:t>Texto mais natural: a Prime Control quer ouvir o cliente.</w:t>
+              <w:t>Dashboard interno oferece CSV, Excel visual e PDF executivo.</w:t>
             </w:r>
           </w:p>
         </w:tc>
@@ -10185,72 +10290,7 @@
                 <w:color w:val="102A43"/>
                 <w:sz w:val="18"/>
               </w:rPr>
-              <w:t>Reforça cuidado e convite direto.</w:t>
-            </w:r>
-          </w:p>
-        </w:tc>
-      </w:tr>
-      <w:tr>
-        <w:tc>
-          <w:tcPr>
-            <w:tcW w:type="dxa" w:w="1944"/>
-            <w:vAlign w:val="center"/>
-          </w:tcPr>
-          <w:p>
-            <w:pPr>
-              <w:spacing w:after="0"/>
-            </w:pPr>
-            <w:r/>
-            <w:r>
-              <w:rPr>
-                <w:rFonts w:ascii="Arial" w:hAnsi="Arial"/>
-                <w:b w:val="0"/>
-                <w:color w:val="102A43"/>
-                <w:sz w:val="18"/>
-              </w:rPr>
-              <w:t>Tela inicial</w:t>
-            </w:r>
-          </w:p>
-        </w:tc>
-        <w:tc>
-          <w:tcPr>
-            <w:tcW w:type="dxa" w:w="3816"/>
-            <w:vAlign w:val="center"/>
-          </w:tcPr>
-          <w:p>
-            <w:pPr>
-              <w:spacing w:after="0"/>
-            </w:pPr>
-            <w:r/>
-            <w:r>
-              <w:rPr>
-                <w:rFonts w:ascii="Arial" w:hAnsi="Arial"/>
-                <w:b w:val="0"/>
-                <w:color w:val="102A43"/>
-                <w:sz w:val="18"/>
-              </w:rPr>
-              <w:t>Raiz do site exibe a landing real da pesquisa.</w:t>
-            </w:r>
-          </w:p>
-        </w:tc>
-        <w:tc>
-          <w:tcPr>
-            <w:tcW w:type="dxa" w:w="3600"/>
-            <w:vAlign w:val="center"/>
-          </w:tcPr>
-          <w:p>
-            <w:pPr>
-              <w:spacing w:after="0"/>
-            </w:pPr>
-            <w:r/>
-            <w:r>
-              <w:rPr>
-                <w:rFonts w:ascii="Arial" w:hAnsi="Arial"/>
-                <w:b w:val="0"/>
-                <w:color w:val="102A43"/>
-                <w:sz w:val="18"/>
-              </w:rPr>
-              <w:t>Evita tela intermediária e reduz confusão.</w:t>
+              <w:t>Apoia análise operacional e apresentação executiva.</w:t>
             </w:r>
           </w:p>
         </w:tc>
@@ -10418,7 +10458,7 @@
           <w:color w:val="102A43"/>
           <w:sz w:val="20"/>
         </w:rPr>
-        <w:t>A landing não deve exibir informações técnicas internas.</w:t>
+        <w:t>A pesquisa oficial não deve exibir informações técnicas internas.</w:t>
       </w:r>
     </w:p>
     <w:p>
@@ -10433,7 +10473,7 @@
           <w:color w:val="102A43"/>
           <w:sz w:val="20"/>
         </w:rPr>
-        <w:t>O topo deve mostrar apenas o tempo estimado; a validade deve aparecer de forma discreta no conteúdo.</w:t>
+        <w:t>O topo deve mostrar tempo estimado e validade da campanha de forma clara.</w:t>
       </w:r>
     </w:p>
     <w:p>
@@ -10448,7 +10488,7 @@
           <w:color w:val="102A43"/>
           <w:sz w:val="20"/>
         </w:rPr>
-        <w:t>A primeira dobra deve conter logo, contexto, benefício, transparência e CTA.</w:t>
+        <w:t>A identificação deve exigir apenas nome, e-mail corporativo, empresa e cargo.</w:t>
       </w:r>
     </w:p>
     <w:p>
@@ -10864,7 +10904,7 @@
                 <w:color w:val="102A43"/>
                 <w:sz w:val="20"/>
               </w:rPr>
-              <w:t>Após a implementação da camada de dados, o documento deve incluir prints do dashboard, exemplo de planilha exportada, eventos reais capturados e leitura inicial do Clarity.</w:t>
+              <w:t>Após a validação com usuários internos, o documento deve incluir prints finais da pesquisa oficial, exemplo real de Excel/PDF exportado, eventos capturados e leitura inicial do Clarity.</w:t>
             </w:r>
           </w:p>
         </w:tc>

</xml_diff>

<commit_message>
Harden admin session security
</commit_message>
<xml_diff>
--- a/deliverables/Prime_Control_NPS_Documentacao_Executiva_Tecnica.docx
+++ b/deliverables/Prime_Control_NPS_Documentacao_Executiva_Tecnica.docx
@@ -389,7 +389,7 @@
           <w:color w:val="5C6F82"/>
           <w:sz w:val="20"/>
         </w:rPr>
-        <w:t>Versão: 1.4 | Atualizado em: 23/05/2026</w:t>
+        <w:t>Versão: 1.4 | Atualizado em: 27/05/2026</w:t>
       </w:r>
     </w:p>
     <w:p>
@@ -7209,7 +7209,7 @@
                 <w:color w:val="102A43"/>
                 <w:sz w:val="18"/>
               </w:rPr>
-              <w:t>Controle interno seguro, HTTPS, LGPD</w:t>
+              <w:t>Controle interno seguro, sessão assinada, HTTPS e LGPD</w:t>
             </w:r>
           </w:p>
         </w:tc>
@@ -7230,7 +7230,7 @@
                 <w:color w:val="102A43"/>
                 <w:sz w:val="18"/>
               </w:rPr>
-              <w:t>Controle de acesso e minimização de dados.</w:t>
+              <w:t>Controle de acesso, minimização de dados e proteção das exportações.</w:t>
             </w:r>
           </w:p>
         </w:tc>
@@ -7762,6 +7762,36 @@
           <w:color w:val="102A43"/>
           <w:sz w:val="20"/>
         </w:rPr>
+        <w:t>Sessão administrativa assinada, sem armazenar senha no cookie.</w:t>
+      </w:r>
+    </w:p>
+    <w:p>
+      <w:pPr>
+        <w:pStyle w:val="ListBullet"/>
+        <w:spacing w:after="60" w:line="269" w:lineRule="auto"/>
+        <w:ind w:left="360"/>
+      </w:pPr>
+      <w:r>
+        <w:rPr>
+          <w:rFonts w:ascii="Arial" w:hAnsi="Arial"/>
+          <w:color w:val="102A43"/>
+          <w:sz w:val="20"/>
+        </w:rPr>
+        <w:t>ADMIN_SESSION_SECRET obrigatório em produção para proteger o painel interno.</w:t>
+      </w:r>
+    </w:p>
+    <w:p>
+      <w:pPr>
+        <w:pStyle w:val="ListBullet"/>
+        <w:spacing w:after="60" w:line="269" w:lineRule="auto"/>
+        <w:ind w:left="360"/>
+      </w:pPr>
+      <w:r>
+        <w:rPr>
+          <w:rFonts w:ascii="Arial" w:hAnsi="Arial"/>
+          <w:color w:val="102A43"/>
+          <w:sz w:val="20"/>
+        </w:rPr>
         <w:t>HTTPS obrigatório e acesso restrito ao dashboard.</w:t>
       </w:r>
     </w:p>
@@ -9010,7 +9040,7 @@
                 <w:color w:val="102A43"/>
                 <w:sz w:val="18"/>
               </w:rPr>
-              <w:t>Next.js, pesquisa one-page oficial na raiz, perguntas preservadas, perguntas numeradas, identificação simplificada, validação visual de e-mail corporativo, APIs internas, Supabase preparado, dashboard interno protegido, exportações CSV/Excel/PDF, logo, identidade visual, Clarity e backups de landing/multi-step.</w:t>
+              <w:t>Next.js, pesquisa one-page oficial na raiz, perguntas preservadas, perguntas numeradas, identificação simplificada, validação visual de e-mail corporativo, APIs internas, Supabase preparado, dashboard interno protegido com sessão assinada, exportações CSV/Excel/PDF, logo, identidade visual, Clarity e backups de landing/multi-step.</w:t>
             </w:r>
           </w:p>
         </w:tc>

</xml_diff>

<commit_message>
Update 2026 survey questions and archive 2027 version
</commit_message>
<xml_diff>
--- a/deliverables/Prime_Control_NPS_Documentacao_Executiva_Tecnica.docx
+++ b/deliverables/Prime_Control_NPS_Documentacao_Executiva_Tecnica.docx
@@ -3451,7 +3451,7 @@
                 <w:color w:val="102A43"/>
                 <w:sz w:val="18"/>
               </w:rPr>
-              <w:t>10 → 1</w:t>
+              <w:t>0 → 10</w:t>
             </w:r>
           </w:p>
         </w:tc>
@@ -3472,7 +3472,7 @@
                 <w:color w:val="102A43"/>
                 <w:sz w:val="18"/>
               </w:rPr>
-              <w:t>Formato atual da interface oficial</w:t>
+              <w:t>Formato atual da pergunta NPS 2026</w:t>
             </w:r>
           </w:p>
         </w:tc>
@@ -3493,7 +3493,72 @@
                 <w:color w:val="102A43"/>
                 <w:sz w:val="18"/>
               </w:rPr>
-              <w:t>Mantém alinhamento com a referência de planilha/GPTW enviada.</w:t>
+              <w:t>Mantém alinhamento com a referência oficial enviada para 2026.</w:t>
+            </w:r>
+          </w:p>
+        </w:tc>
+      </w:tr>
+      <w:tr>
+        <w:tc>
+          <w:tcPr>
+            <w:tcW w:type="dxa" w:w="2232"/>
+            <w:vAlign w:val="center"/>
+          </w:tcPr>
+          <w:p>
+            <w:pPr>
+              <w:spacing w:after="0"/>
+            </w:pPr>
+            <w:r/>
+            <w:r>
+              <w:rPr>
+                <w:rFonts w:ascii="Arial" w:hAnsi="Arial"/>
+                <w:b w:val="0"/>
+                <w:color w:val="102A43"/>
+                <w:sz w:val="18"/>
+              </w:rPr>
+              <w:t>1 → 5</w:t>
+            </w:r>
+          </w:p>
+        </w:tc>
+        <w:tc>
+          <w:tcPr>
+            <w:tcW w:type="dxa" w:w="3168"/>
+            <w:vAlign w:val="center"/>
+          </w:tcPr>
+          <w:p>
+            <w:pPr>
+              <w:spacing w:after="0"/>
+            </w:pPr>
+            <w:r/>
+            <w:r>
+              <w:rPr>
+                <w:rFonts w:ascii="Arial" w:hAnsi="Arial"/>
+                <w:b w:val="0"/>
+                <w:color w:val="102A43"/>
+                <w:sz w:val="18"/>
+              </w:rPr>
+              <w:t>Formato atual das perguntas de satisfação 2026</w:t>
+            </w:r>
+          </w:p>
+        </w:tc>
+        <w:tc>
+          <w:tcPr>
+            <w:tcW w:type="dxa" w:w="3960"/>
+            <w:vAlign w:val="center"/>
+          </w:tcPr>
+          <w:p>
+            <w:pPr>
+              <w:spacing w:after="0"/>
+            </w:pPr>
+            <w:r/>
+            <w:r>
+              <w:rPr>
+                <w:rFonts w:ascii="Arial" w:hAnsi="Arial"/>
+                <w:b w:val="0"/>
+                <w:color w:val="102A43"/>
+                <w:sz w:val="18"/>
+              </w:rPr>
+              <w:t>Reduz esforço de escolha nas avaliações complementares.</w:t>
             </w:r>
           </w:p>
         </w:tc>
@@ -9974,7 +10039,7 @@
                 <w:color w:val="102A43"/>
                 <w:sz w:val="18"/>
               </w:rPr>
-              <w:t>Prazo de validade exibido no topo: 01/06/2026.</w:t>
+              <w:t>Prazo exibido no topo: disponível por 7 dias após o envio.</w:t>
             </w:r>
           </w:p>
         </w:tc>
@@ -9995,7 +10060,7 @@
                 <w:color w:val="102A43"/>
                 <w:sz w:val="18"/>
               </w:rPr>
-              <w:t>Deixa claro o período ativo da campanha.</w:t>
+              <w:t>Funciona melhor para disparos em datas diferentes via e-mail/HubSpot.</w:t>
             </w:r>
           </w:p>
         </w:tc>

</xml_diff>